<commit_message>
refine resonance page copy
</commit_message>
<xml_diff>
--- a/document/dev-product-process-training/speaker-notes.docx
+++ b/document/dev-product-process-training/speaker-notes.docx
@@ -4,449 +4,24 @@
   <w:body>
     <w:p>
       <w:pPr>
-        <w:jc w:val="left"/>
+        <w:pStyle w:val="Heading1"/>
       </w:pPr>
       <w:r>
-        <w:rPr>
-          <w:b/>
-          <w:color w:val="172033"/>
-          <w:sz w:val="46"/>
-        </w:rPr>
-        <w:t>研发流程、项目协作与产品思维科普</w:t>
+        <w:t>《从做完一件事，到做好一件事》讲稿提词卡</w:t>
       </w:r>
     </w:p>
     <w:p>
-      <w:pPr>
-        <w:spacing w:after="240"/>
-      </w:pPr>
       <w:r>
-        <w:rPr>
-          <w:color w:val="5D6678"/>
-          <w:sz w:val="22"/>
-        </w:rPr>
-        <w:t>讲稿手册 | 16:9 HTML 母版配套 | 产品/BI 场 + 研发场</w:t>
+        <w:t>使用方式：这不是逐字稿，更像每页的口播提词。你临场能力强，所以每页只保留“关键词 + 一段短讲法”，方便现场自由发挥。</w:t>
       </w:r>
     </w:p>
-    <w:p>
-      <w:pPr>
-        <w:pStyle w:val="Heading1"/>
-      </w:pPr>
-      <w:r>
-        <w:t>使用方式</w:t>
-      </w:r>
-    </w:p>
-    <w:tbl>
-      <w:tblPr>
-        <w:tblStyle w:val="TableGrid"/>
-        <w:tblW w:type="auto" w:w="0"/>
-        <w:jc w:val="center"/>
-        <w:tblLook w:firstColumn="1" w:firstRow="1" w:lastColumn="0" w:lastRow="0" w:noHBand="0" w:noVBand="1" w:val="04A0"/>
-      </w:tblPr>
-      <w:tblGrid>
-        <w:gridCol w:w="2541"/>
-        <w:gridCol w:w="2541"/>
-        <w:gridCol w:w="2541"/>
-        <w:gridCol w:w="2541"/>
-      </w:tblGrid>
-      <w:tr>
-        <w:tc>
-          <w:tcPr>
-            <w:tcW w:type="dxa" w:w="2541"/>
-            <w:shd w:fill="E8EEF5"/>
-            <w:tcMar>
-              <w:top w:w="80" w:type="dxa"/>
-              <w:start w:w="120" w:type="dxa"/>
-              <w:bottom w:w="80" w:type="dxa"/>
-              <w:end w:w="120" w:type="dxa"/>
-            </w:tcMar>
-            <w:vAlign w:val="center"/>
-          </w:tcPr>
-          <w:p>
-            <w:r>
-              <w:rPr>
-                <w:b/>
-              </w:rPr>
-              <w:t>场次</w:t>
-            </w:r>
-          </w:p>
-        </w:tc>
-        <w:tc>
-          <w:tcPr>
-            <w:tcW w:type="dxa" w:w="2541"/>
-            <w:shd w:fill="E8EEF5"/>
-            <w:tcMar>
-              <w:top w:w="80" w:type="dxa"/>
-              <w:start w:w="120" w:type="dxa"/>
-              <w:bottom w:w="80" w:type="dxa"/>
-              <w:end w:w="120" w:type="dxa"/>
-            </w:tcMar>
-            <w:vAlign w:val="center"/>
-          </w:tcPr>
-          <w:p>
-            <w:r>
-              <w:rPr>
-                <w:b/>
-              </w:rPr>
-              <w:t>建议时长</w:t>
-            </w:r>
-          </w:p>
-        </w:tc>
-        <w:tc>
-          <w:tcPr>
-            <w:tcW w:type="dxa" w:w="2541"/>
-            <w:shd w:fill="E8EEF5"/>
-            <w:tcMar>
-              <w:top w:w="80" w:type="dxa"/>
-              <w:start w:w="120" w:type="dxa"/>
-              <w:bottom w:w="80" w:type="dxa"/>
-              <w:end w:w="120" w:type="dxa"/>
-            </w:tcMar>
-            <w:vAlign w:val="center"/>
-          </w:tcPr>
-          <w:p>
-            <w:r>
-              <w:rPr>
-                <w:b/>
-              </w:rPr>
-              <w:t>重点页</w:t>
-            </w:r>
-          </w:p>
-        </w:tc>
-        <w:tc>
-          <w:tcPr>
-            <w:tcW w:type="dxa" w:w="2541"/>
-            <w:shd w:fill="E8EEF5"/>
-            <w:tcMar>
-              <w:top w:w="80" w:type="dxa"/>
-              <w:start w:w="120" w:type="dxa"/>
-              <w:bottom w:w="80" w:type="dxa"/>
-              <w:end w:w="120" w:type="dxa"/>
-            </w:tcMar>
-            <w:vAlign w:val="center"/>
-          </w:tcPr>
-          <w:p>
-            <w:r>
-              <w:rPr>
-                <w:b/>
-              </w:rPr>
-              <w:t>讲法</w:t>
-            </w:r>
-          </w:p>
-        </w:tc>
-      </w:tr>
-      <w:tr>
-        <w:tc>
-          <w:tcPr>
-            <w:tcW w:type="dxa" w:w="2541"/>
-            <w:tcMar>
-              <w:top w:w="80" w:type="dxa"/>
-              <w:start w:w="120" w:type="dxa"/>
-              <w:bottom w:w="80" w:type="dxa"/>
-              <w:end w:w="120" w:type="dxa"/>
-            </w:tcMar>
-            <w:vAlign w:val="center"/>
-          </w:tcPr>
-          <w:p>
-            <w:r>
-              <w:t>产品/BI 场</w:t>
-            </w:r>
-          </w:p>
-        </w:tc>
-        <w:tc>
-          <w:tcPr>
-            <w:tcW w:type="dxa" w:w="2541"/>
-            <w:tcMar>
-              <w:top w:w="80" w:type="dxa"/>
-              <w:start w:w="120" w:type="dxa"/>
-              <w:bottom w:w="80" w:type="dxa"/>
-              <w:end w:w="120" w:type="dxa"/>
-            </w:tcMar>
-            <w:vAlign w:val="center"/>
-          </w:tcPr>
-          <w:p>
-            <w:r>
-              <w:t>15 min</w:t>
-            </w:r>
-          </w:p>
-        </w:tc>
-        <w:tc>
-          <w:tcPr>
-            <w:tcW w:type="dxa" w:w="2541"/>
-            <w:tcMar>
-              <w:top w:w="80" w:type="dxa"/>
-              <w:start w:w="120" w:type="dxa"/>
-              <w:bottom w:w="80" w:type="dxa"/>
-              <w:end w:w="120" w:type="dxa"/>
-            </w:tcMar>
-            <w:vAlign w:val="center"/>
-          </w:tcPr>
-          <w:p>
-            <w:r>
-              <w:t>1-9, 11-17, 18</w:t>
-            </w:r>
-          </w:p>
-        </w:tc>
-        <w:tc>
-          <w:tcPr>
-            <w:tcW w:type="dxa" w:w="2541"/>
-            <w:tcMar>
-              <w:top w:w="80" w:type="dxa"/>
-              <w:start w:w="120" w:type="dxa"/>
-              <w:bottom w:w="80" w:type="dxa"/>
-              <w:end w:w="120" w:type="dxa"/>
-            </w:tcMar>
-            <w:vAlign w:val="center"/>
-          </w:tcPr>
-          <w:p>
-            <w:r>
-              <w:t>需求质量、UX、验收、依赖、变更、GSheet</w:t>
-            </w:r>
-          </w:p>
-        </w:tc>
-      </w:tr>
-      <w:tr>
-        <w:tc>
-          <w:tcPr>
-            <w:tcW w:type="dxa" w:w="2541"/>
-            <w:tcMar>
-              <w:top w:w="80" w:type="dxa"/>
-              <w:start w:w="120" w:type="dxa"/>
-              <w:bottom w:w="80" w:type="dxa"/>
-              <w:end w:w="120" w:type="dxa"/>
-            </w:tcMar>
-            <w:vAlign w:val="center"/>
-          </w:tcPr>
-          <w:p>
-            <w:r>
-              <w:t>研发场</w:t>
-            </w:r>
-          </w:p>
-        </w:tc>
-        <w:tc>
-          <w:tcPr>
-            <w:tcW w:type="dxa" w:w="2541"/>
-            <w:tcMar>
-              <w:top w:w="80" w:type="dxa"/>
-              <w:start w:w="120" w:type="dxa"/>
-              <w:bottom w:w="80" w:type="dxa"/>
-              <w:end w:w="120" w:type="dxa"/>
-            </w:tcMar>
-            <w:vAlign w:val="center"/>
-          </w:tcPr>
-          <w:p>
-            <w:r>
-              <w:t>15 min</w:t>
-            </w:r>
-          </w:p>
-        </w:tc>
-        <w:tc>
-          <w:tcPr>
-            <w:tcW w:type="dxa" w:w="2541"/>
-            <w:tcMar>
-              <w:top w:w="80" w:type="dxa"/>
-              <w:start w:w="120" w:type="dxa"/>
-              <w:bottom w:w="80" w:type="dxa"/>
-              <w:end w:w="120" w:type="dxa"/>
-            </w:tcMar>
-            <w:vAlign w:val="center"/>
-          </w:tcPr>
-          <w:p>
-            <w:r>
-              <w:t>1-5, 10-18</w:t>
-            </w:r>
-          </w:p>
-        </w:tc>
-        <w:tc>
-          <w:tcPr>
-            <w:tcW w:type="dxa" w:w="2541"/>
-            <w:tcMar>
-              <w:top w:w="80" w:type="dxa"/>
-              <w:start w:w="120" w:type="dxa"/>
-              <w:bottom w:w="80" w:type="dxa"/>
-              <w:end w:w="120" w:type="dxa"/>
-            </w:tcMar>
-            <w:vAlign w:val="center"/>
-          </w:tcPr>
-          <w:p>
-            <w:r>
-              <w:t>接口契约、联调准备、版本切片、风险、上下游同理心</w:t>
-            </w:r>
-          </w:p>
-        </w:tc>
-      </w:tr>
-      <w:tr>
-        <w:tc>
-          <w:tcPr>
-            <w:tcW w:type="dxa" w:w="2541"/>
-            <w:tcMar>
-              <w:top w:w="80" w:type="dxa"/>
-              <w:start w:w="120" w:type="dxa"/>
-              <w:bottom w:w="80" w:type="dxa"/>
-              <w:end w:w="120" w:type="dxa"/>
-            </w:tcMar>
-            <w:vAlign w:val="center"/>
-          </w:tcPr>
-          <w:p>
-            <w:r>
-              <w:t>母版全讲</w:t>
-            </w:r>
-          </w:p>
-        </w:tc>
-        <w:tc>
-          <w:tcPr>
-            <w:tcW w:type="dxa" w:w="2541"/>
-            <w:tcMar>
-              <w:top w:w="80" w:type="dxa"/>
-              <w:start w:w="120" w:type="dxa"/>
-              <w:bottom w:w="80" w:type="dxa"/>
-              <w:end w:w="120" w:type="dxa"/>
-            </w:tcMar>
-            <w:vAlign w:val="center"/>
-          </w:tcPr>
-          <w:p>
-            <w:r>
-              <w:t>20-25 min</w:t>
-            </w:r>
-          </w:p>
-        </w:tc>
-        <w:tc>
-          <w:tcPr>
-            <w:tcW w:type="dxa" w:w="2541"/>
-            <w:tcMar>
-              <w:top w:w="80" w:type="dxa"/>
-              <w:start w:w="120" w:type="dxa"/>
-              <w:bottom w:w="80" w:type="dxa"/>
-              <w:end w:w="120" w:type="dxa"/>
-            </w:tcMar>
-            <w:vAlign w:val="center"/>
-          </w:tcPr>
-          <w:p>
-            <w:r>
-              <w:t>1-18</w:t>
-            </w:r>
-          </w:p>
-        </w:tc>
-        <w:tc>
-          <w:tcPr>
-            <w:tcW w:type="dxa" w:w="2541"/>
-            <w:tcMar>
-              <w:top w:w="80" w:type="dxa"/>
-              <w:start w:w="120" w:type="dxa"/>
-              <w:bottom w:w="80" w:type="dxa"/>
-              <w:end w:w="120" w:type="dxa"/>
-            </w:tcMar>
-            <w:vAlign w:val="center"/>
-          </w:tcPr>
-          <w:p>
-            <w:r>
-              <w:t>适合完整科普或给新同学回看</w:t>
-            </w:r>
-          </w:p>
-        </w:tc>
-      </w:tr>
-    </w:tbl>
-    <w:p>
-      <w:r>
-        <w:t>建议开场先说明：本材料不是教大家成为专业 PM 或 QA，而是建立共同协作语言。核心目标是让合作方提前知道目标、边界、依赖、风险和验收。</w:t>
-      </w:r>
-    </w:p>
-    <w:p>
-      <w:pPr>
-        <w:pStyle w:val="Heading1"/>
-      </w:pPr>
-      <w:r>
-        <w:t>两场培训的推荐节奏</w:t>
-      </w:r>
-    </w:p>
+    <w:p/>
     <w:p>
       <w:pPr>
         <w:pStyle w:val="Heading2"/>
       </w:pPr>
       <w:r>
-        <w:t>产品/BI 场</w:t>
-      </w:r>
-    </w:p>
-    <w:p>
-      <w:pPr>
-        <w:pStyle w:val="ListBullet"/>
-        <w:spacing w:after="60"/>
-      </w:pPr>
-      <w:r>
-        <w:t>前 3 分钟：为什么现在要懂流程 + 乘车码案例。</w:t>
-      </w:r>
-    </w:p>
-    <w:p>
-      <w:pPr>
-        <w:pStyle w:val="ListBullet"/>
-        <w:spacing w:after="60"/>
-      </w:pPr>
-      <w:r>
-        <w:t>中间 8 分钟：好需求模板、UX 双视角、视觉层级、阶段交付物。</w:t>
-      </w:r>
-    </w:p>
-    <w:p>
-      <w:pPr>
-        <w:pStyle w:val="ListBullet"/>
-        <w:spacing w:after="60"/>
-      </w:pPr>
-      <w:r>
-        <w:t>最后 4 分钟：SIT 协作、变更/延期、GSheet、Checklist。</w:t>
-      </w:r>
-    </w:p>
-    <w:p>
-      <w:pPr>
-        <w:pStyle w:val="Heading2"/>
-      </w:pPr>
-      <w:r>
-        <w:t>研发场</w:t>
-      </w:r>
-    </w:p>
-    <w:p>
-      <w:pPr>
-        <w:pStyle w:val="ListBullet"/>
-        <w:spacing w:after="60"/>
-      </w:pPr>
-      <w:r>
-        <w:t>前 3 分钟：为什么现在要懂流程 + 乘车码系统视角。</w:t>
-      </w:r>
-    </w:p>
-    <w:p>
-      <w:pPr>
-        <w:pStyle w:val="ListBullet"/>
-        <w:spacing w:after="60"/>
-      </w:pPr>
-      <w:r>
-        <w:t>中间 8 分钟：研发流程、交付物、SIT、版本切片。</w:t>
-      </w:r>
-    </w:p>
-    <w:p>
-      <w:pPr>
-        <w:pStyle w:val="ListBullet"/>
-        <w:spacing w:after="60"/>
-      </w:pPr>
-      <w:r>
-        <w:t>最后 4 分钟：变更/延期、GSheet、研发 Checklist。</w:t>
-      </w:r>
-    </w:p>
-    <w:p>
-      <w:pPr>
-        <w:pStyle w:val="Heading1"/>
-      </w:pPr>
-      <w:r>
-        <w:t>逐页讲稿</w:t>
-      </w:r>
-    </w:p>
-    <w:p>
-      <w:pPr>
-        <w:pStyle w:val="Heading2"/>
-      </w:pPr>
-      <w:r>
-        <w:t>1. 为什么现在要懂研发流程</w:t>
-      </w:r>
-    </w:p>
-    <w:p>
-      <w:r>
-        <w:t>建议用时：1.0 min</w:t>
+        <w:t>01. 封面</w:t>
       </w:r>
     </w:p>
     <w:p>
@@ -454,10 +29,10 @@
         <w:rPr>
           <w:b/>
         </w:rPr>
-        <w:t>主讲稿：</w:t>
+        <w:t>关键词：</w:t>
       </w:r>
       <w:r>
-        <w:t>开场可以直接说：这不是项目管理课，也不是研发流程考试。我们今天只解决一个问题：当 AI 让每个人都能更快地产出需求、代码和文档时，团队怎样不更快地返工？流程的本质不是管人，而是让合作方更容易和你合作。</w:t>
+        <w:t>AI 时代、做完到做好、基本功、判断力</w:t>
       </w:r>
     </w:p>
     <w:p>
@@ -465,10 +40,21 @@
         <w:rPr>
           <w:b/>
         </w:rPr>
-        <w:t>产品/BI 场：</w:t>
+        <w:t>讲稿：</w:t>
       </w:r>
+    </w:p>
+    <w:p>
       <w:r>
-        <w:t>强调 BI/产品写需求的质量，会直接决定研发和 AI 能不能产出正确东西。</w:t>
+        <w:t>那我们今天聊一个很基础的问题：AI 已经能让我们更快把东西做出来，但“做出来”和“做好”中间其实还有一段距离。所以这次不讲很重的流程制度，而是聊三组基本功：项目怎么说清目标，产品怎么写清需求，研发怎么交稳版本。</w:t>
+      </w:r>
+    </w:p>
+    <w:p/>
+    <w:p>
+      <w:pPr>
+        <w:pStyle w:val="Heading2"/>
+      </w:pPr>
+      <w:r>
+        <w:t>02. Who am I</w:t>
       </w:r>
     </w:p>
     <w:p>
@@ -476,10 +62,10 @@
         <w:rPr>
           <w:b/>
         </w:rPr>
-        <w:t>研发场：</w:t>
+        <w:t>关键词：</w:t>
       </w:r>
       <w:r>
-        <w:t>强调代码写得快只是局部效率；真正交付要看联调、验收、上线和风险。</w:t>
+        <w:t>项目现场、AI 转型、被毒打、踩坑</w:t>
       </w:r>
     </w:p>
     <w:p>
@@ -487,23 +73,21 @@
         <w:rPr>
           <w:b/>
         </w:rPr>
-        <w:t>跳页建议：</w:t>
-      </w:r>
-      <w:r>
-        <w:t>两场都保留。</w:t>
+        <w:t>讲稿：</w:t>
       </w:r>
     </w:p>
+    <w:p>
+      <w:r>
+        <w:t>先简单介绍一下我自己。我不是站在外面讲流程的人，过去做过甲方项目、监管数据合规、多系统对接，也经历过延期、变更、拒绝验收这些很真实的项目现场。现在也在做 BI 和 AI PMO，所以今天更多是把一些被项目毒打出来的经验，和现在 AI 转型里踩到的新坑放在一起聊。</w:t>
+      </w:r>
+    </w:p>
+    <w:p/>
     <w:p>
       <w:pPr>
         <w:pStyle w:val="Heading2"/>
       </w:pPr>
       <w:r>
-        <w:t>2. 今天只讲一件事</w:t>
-      </w:r>
-    </w:p>
-    <w:p>
-      <w:r>
-        <w:t>建议用时：1.0 min</w:t>
+        <w:t>03. 共鸣问题</w:t>
       </w:r>
     </w:p>
     <w:p>
@@ -511,10 +95,10 @@
         <w:rPr>
           <w:b/>
         </w:rPr>
-        <w:t>主讲稿：</w:t>
+        <w:t>关键词：</w:t>
       </w:r>
       <w:r>
-        <w:t>把整场培训收束到一条链路：一个功能从用户问题开始，经过需求、UX、技术方案、开发联调、测试上线，最后进入复盘迭代。后面所有方法都服务这条链路。</w:t>
+        <w:t>AI vibe coding、没有灵魂、推翻重来、判断</w:t>
       </w:r>
     </w:p>
     <w:p>
@@ -522,10 +106,21 @@
         <w:rPr>
           <w:b/>
         </w:rPr>
-        <w:t>产品/BI 场：</w:t>
+        <w:t>讲稿：</w:t>
       </w:r>
+    </w:p>
+    <w:p>
       <w:r>
-        <w:t>多讲需求、UX、验收。</w:t>
+        <w:t>先从大家可能都有的感觉讲起。现在 AI 很容易帮我们做出一个 demo，但有时候就是会觉得没有灵魂，没有别人古法手搓出来的东西好用。研发侧也是一样，大家都在推进，但联调当天才发现很多东西要推翻重来。所以今天讲流程，本质上是为了把这些“说不上来的问题”提前变成可描述、可修改、可协作的问题。</w:t>
+      </w:r>
+    </w:p>
+    <w:p/>
+    <w:p>
+      <w:pPr>
+        <w:pStyle w:val="Heading2"/>
+      </w:pPr>
+      <w:r>
+        <w:t>04. 三组能力框架</w:t>
       </w:r>
     </w:p>
     <w:p>
@@ -533,10 +128,10 @@
         <w:rPr>
           <w:b/>
         </w:rPr>
-        <w:t>研发场：</w:t>
+        <w:t>关键词：</w:t>
       </w:r>
       <w:r>
-        <w:t>多讲技术方案、联调、上线。</w:t>
+        <w:t>项目、产品、研发、共同语言</w:t>
       </w:r>
     </w:p>
     <w:p>
@@ -544,23 +139,21 @@
         <w:rPr>
           <w:b/>
         </w:rPr>
-        <w:t>跳页建议：</w:t>
-      </w:r>
-      <w:r>
-        <w:t>两场都保留。</w:t>
+        <w:t>讲稿：</w:t>
       </w:r>
     </w:p>
+    <w:p>
+      <w:r>
+        <w:t>这套材料分三块：项目管理思维、产品思维培养、研发管理流程。它们不是三件互相独立的事情。产品写不清，研发会返工；研发风险说不清，项目会延期；项目节奏不透明，所有人都会被动。所以我们先建立一套共同语言。</w:t>
+      </w:r>
+    </w:p>
+    <w:p/>
     <w:p>
       <w:pPr>
         <w:pStyle w:val="Heading2"/>
       </w:pPr>
       <w:r>
-        <w:t>3. Benchmark：乘车码新增城市上线</w:t>
-      </w:r>
-    </w:p>
-    <w:p>
-      <w:r>
-        <w:t>建议用时：1.0 min</w:t>
+        <w:t>05. 项目管理思维封面</w:t>
       </w:r>
     </w:p>
     <w:p>
@@ -568,10 +161,10 @@
         <w:rPr>
           <w:b/>
         </w:rPr>
-        <w:t>主讲稿：</w:t>
+        <w:t>关键词：</w:t>
       </w:r>
       <w:r>
-        <w:t>用乘车码是因为大家都懂，但它不是一个简单页面。用户看到的是打开小程序、刷一个码；团队要处理的是城市、线路、设备、状态、异常和上线观测。支付只作为依赖点，不展开支付系统。</w:t>
+        <w:t>目标、节奏、依赖、风险、可见</w:t>
       </w:r>
     </w:p>
     <w:p>
@@ -579,10 +172,21 @@
         <w:rPr>
           <w:b/>
         </w:rPr>
-        <w:t>产品/BI 场：</w:t>
+        <w:t>讲稿：</w:t>
       </w:r>
+    </w:p>
+    <w:p>
       <w:r>
-        <w:t>讲清为什么要从真实用户路径出发。</w:t>
+        <w:t>第一部分先讲项目管理。项目管理不是多填几张表，而是让目标、节奏、依赖和风险持续可见。尤其是大项目、跨模块项目，很多问题不是大家不努力，而是信息没有提前对齐。</w:t>
+      </w:r>
+    </w:p>
+    <w:p/>
+    <w:p>
+      <w:pPr>
+        <w:pStyle w:val="Heading2"/>
+      </w:pPr>
+      <w:r>
+        <w:t>06. 项目环节与角色关注点</w:t>
       </w:r>
     </w:p>
     <w:p>
@@ -590,10 +194,10 @@
         <w:rPr>
           <w:b/>
         </w:rPr>
-        <w:t>研发场：</w:t>
+        <w:t>关键词：</w:t>
       </w:r>
       <w:r>
-        <w:t>讲清为什么功能背后有上下游链路。</w:t>
+        <w:t>项目/产品/研发、不同关注点、阶段交付物</w:t>
       </w:r>
     </w:p>
     <w:p>
@@ -601,23 +205,21 @@
         <w:rPr>
           <w:b/>
         </w:rPr>
-        <w:t>跳页建议：</w:t>
-      </w:r>
-      <w:r>
-        <w:t>两场都保留。</w:t>
+        <w:t>讲稿：</w:t>
       </w:r>
     </w:p>
+    <w:p>
+      <w:r>
+        <w:t>这一页想说明的是，同一个项目阶段，不同角色关注点不一样。项目经理看 owner、时间和风险；产品看场景、范围和验收；研发看方案、依赖和可实现性。所以一个阶段推进不下去的时候，往往不是某个人没干活，而是某个角色该交付的信息没有交出来。</w:t>
+      </w:r>
+    </w:p>
+    <w:p/>
     <w:p>
       <w:pPr>
         <w:pStyle w:val="Heading2"/>
       </w:pPr>
       <w:r>
-        <w:t>4. 乘车码不是一个页面</w:t>
-      </w:r>
-    </w:p>
-    <w:p>
-      <w:r>
-        <w:t>建议用时：1.2 min</w:t>
+        <w:t>07. 计划视图</w:t>
       </w:r>
     </w:p>
     <w:p>
@@ -625,10 +227,10 @@
         <w:rPr>
           <w:b/>
         </w:rPr>
-        <w:t>主讲稿：</w:t>
+        <w:t>关键词：</w:t>
       </w:r>
       <w:r>
-        <w:t>这里要打破一个常见误区：功能不是页面。功能包括前台体验、后台链路、异常处理和上线观测。产品如果只写页面，研发如果只做页面，最后一定会在联调和上线时暴露问题。</w:t>
+        <w:t>甘特图、依赖、风险、共同视图</w:t>
       </w:r>
     </w:p>
     <w:p>
@@ -636,10 +238,21 @@
         <w:rPr>
           <w:b/>
         </w:rPr>
-        <w:t>产品/BI 场：</w:t>
+        <w:t>讲稿：</w:t>
       </w:r>
+    </w:p>
+    <w:p>
       <w:r>
-        <w:t>强调产品边界：哪些状态、哪些异常、哪些客服/运营动作要被提前想到。</w:t>
+        <w:t>那么计划到底有什么用？不是为了做一张好看的图，而是让大家看到同一件事的不同侧面。时间视图看并行和卡点，依赖视图看谁在等谁，风险视图看哪里需要提前决策。好的计划应该让合作方提前知道：我什么时候会被影响，我要准备什么。</w:t>
+      </w:r>
+    </w:p>
+    <w:p/>
+    <w:p>
+      <w:pPr>
+        <w:pStyle w:val="Heading2"/>
+      </w:pPr>
+      <w:r>
+        <w:t>08. 最小可用计划</w:t>
       </w:r>
     </w:p>
     <w:p>
@@ -647,10 +260,10 @@
         <w:rPr>
           <w:b/>
         </w:rPr>
-        <w:t>研发场：</w:t>
+        <w:t>关键词：</w:t>
       </w:r>
       <w:r>
-        <w:t>强调接口、配置、日志、下游设备、灰度指标。</w:t>
+        <w:t>目标、owner、时间、风险、下一步</w:t>
       </w:r>
     </w:p>
     <w:p>
@@ -658,23 +271,21 @@
         <w:rPr>
           <w:b/>
         </w:rPr>
-        <w:t>跳页建议：</w:t>
-      </w:r>
-      <w:r>
-        <w:t>两场都保留。</w:t>
+        <w:t>讲稿：</w:t>
       </w:r>
     </w:p>
+    <w:p>
+      <w:r>
+        <w:t>如果不想把项目管理做得太复杂，最小可用计划至少回答四个问题：目标是什么，谁负责什么，什么时候交什么，如果卡住会影响哪里。只要这几个问题清楚，很多沟通成本就能提前省掉。</w:t>
+      </w:r>
+    </w:p>
+    <w:p/>
     <w:p>
       <w:pPr>
         <w:pStyle w:val="Heading2"/>
       </w:pPr>
       <w:r>
-        <w:t>5. 一份材料，两场讲法</w:t>
-      </w:r>
-    </w:p>
-    <w:p>
-      <w:r>
-        <w:t>建议用时：0.6 min</w:t>
+        <w:t>09. 版本管理</w:t>
       </w:r>
     </w:p>
     <w:p>
@@ -682,10 +293,10 @@
         <w:rPr>
           <w:b/>
         </w:rPr>
-        <w:t>主讲稿：</w:t>
+        <w:t>关键词：</w:t>
       </w:r>
       <w:r>
-        <w:t>这页是导览。产品/BI 场重点是做对的东西；研发场重点是做稳的东西。两者不是割裂的，项目管理思维是中间的共同语言。</w:t>
+        <w:t>大版本、小版本、控风险、渐进交付</w:t>
       </w:r>
     </w:p>
     <w:p>
@@ -693,10 +304,21 @@
         <w:rPr>
           <w:b/>
         </w:rPr>
-        <w:t>产品/BI 场：</w:t>
+        <w:t>讲稿：</w:t>
       </w:r>
+    </w:p>
+    <w:p>
       <w:r>
-        <w:t>讲左边路线。</w:t>
+        <w:t>版本管理的核心是把风险拆小。大版本用来定目标，小版本用来控风险。尤其是复杂项目里，如果所有东西都等最后一起上线，问题会集中爆发。更好的方式是拆成能验证的小版本，每一版都能沉淀反馈。</w:t>
+      </w:r>
+    </w:p>
+    <w:p/>
+    <w:p>
+      <w:pPr>
+        <w:pStyle w:val="Heading2"/>
+      </w:pPr>
+      <w:r>
+        <w:t>10. 变更管理</w:t>
       </w:r>
     </w:p>
     <w:p>
@@ -704,10 +326,10 @@
         <w:rPr>
           <w:b/>
         </w:rPr>
-        <w:t>研发场：</w:t>
+        <w:t>关键词：</w:t>
       </w:r>
       <w:r>
-        <w:t>讲右边路线。</w:t>
+        <w:t>scope、时间、依赖、验收、影响</w:t>
       </w:r>
     </w:p>
     <w:p>
@@ -715,23 +337,21 @@
         <w:rPr>
           <w:b/>
         </w:rPr>
-        <w:t>跳页建议：</w:t>
-      </w:r>
-      <w:r>
-        <w:t>两场都保留，可快速过。</w:t>
+        <w:t>讲稿：</w:t>
       </w:r>
     </w:p>
+    <w:p>
+      <w:r>
+        <w:t>需求变更本身不是问题，问题是变更进来以后没有人说清楚影响。一个变更至少要判断四件事：影响不影响当前 scope，影响不影响时间，影响不影响上下游依赖，验收标准要不要改。这样大家才知道这个变更的真实代价。</w:t>
+      </w:r>
+    </w:p>
+    <w:p/>
     <w:p>
       <w:pPr>
         <w:pStyle w:val="Heading2"/>
       </w:pPr>
       <w:r>
-        <w:t>6. BI 写需求，不是写我要什么</w:t>
-      </w:r>
-    </w:p>
-    <w:p>
-      <w:r>
-        <w:t>建议用时：1.4 min</w:t>
+        <w:t>11. 风险与延期</w:t>
       </w:r>
     </w:p>
     <w:p>
@@ -739,10 +359,10 @@
         <w:rPr>
           <w:b/>
         </w:rPr>
-        <w:t>主讲稿：</w:t>
+        <w:t>关键词：</w:t>
       </w:r>
       <w:r>
-        <w:t>坏需求的典型写法是：做一个乘车码页面。它听起来明确，其实研发不知道怎么拆，测试不知道怎么验，UX 不知道主路径是什么。好需求要写用户、场景、目标和验收。</w:t>
+        <w:t>影响、选项、建议、决策</w:t>
       </w:r>
     </w:p>
     <w:p>
@@ -750,10 +370,21 @@
         <w:rPr>
           <w:b/>
         </w:rPr>
-        <w:t>产品/BI 场：</w:t>
+        <w:t>讲稿：</w:t>
       </w:r>
+    </w:p>
+    <w:p>
       <w:r>
-        <w:t>重点页。可以让听众回忆自己平时写过的需求是否也只有一句功能名。</w:t>
+        <w:t>风险同步不是单纯报坏消息，而是帮助团队做决策。比较好的表达方式是：现在卡点是什么，会影响哪个时间点，有哪些选项，我建议选哪个，以及需要谁什么时候确认。这样风险就从一个情绪问题，变成一个可以处理的问题。</w:t>
+      </w:r>
+    </w:p>
+    <w:p/>
+    <w:p>
+      <w:pPr>
+        <w:pStyle w:val="Heading2"/>
+      </w:pPr>
+      <w:r>
+        <w:t>12. 产品思维培养封面</w:t>
       </w:r>
     </w:p>
     <w:p>
@@ -761,10 +392,10 @@
         <w:rPr>
           <w:b/>
         </w:rPr>
-        <w:t>研发场：</w:t>
+        <w:t>关键词：</w:t>
       </w:r>
       <w:r>
-        <w:t>快速过，但可以提醒研发：看见坏需求要主动追问，不要闷头做。</w:t>
+        <w:t>用户任务、主路径、取舍、验收</w:t>
       </w:r>
     </w:p>
     <w:p>
@@ -772,23 +403,21 @@
         <w:rPr>
           <w:b/>
         </w:rPr>
-        <w:t>跳页建议：</w:t>
-      </w:r>
-      <w:r>
-        <w:t>研发场可压缩。</w:t>
+        <w:t>讲稿：</w:t>
       </w:r>
     </w:p>
+    <w:p>
+      <w:r>
+        <w:t>第二部分讲产品思维。产品思维不是把页面画出来，也不是把功能堆满，而是判断用户到底要完成什么任务，并且把主路径、状态、边界和验收写清楚。</w:t>
+      </w:r>
+    </w:p>
+    <w:p/>
     <w:p>
       <w:pPr>
         <w:pStyle w:val="Heading2"/>
       </w:pPr>
       <w:r>
-        <w:t>7. 好需求模板</w:t>
-      </w:r>
-    </w:p>
-    <w:p>
-      <w:r>
-        <w:t>建议用时：1.8 min</w:t>
+        <w:t>13. 深圳微信乘车码案例</w:t>
       </w:r>
     </w:p>
     <w:p>
@@ -796,10 +425,10 @@
         <w:rPr>
           <w:b/>
         </w:rPr>
-        <w:t>主讲稿：</w:t>
+        <w:t>关键词：</w:t>
       </w:r>
       <w:r>
-        <w:t>这页可以慢一点。需求不是越长越好，而是关键字段要齐。背景说明为什么现在做；用户和场景说明谁在什么时候用；范围和不做什么帮助版本收口；验收、依赖和风险帮助研发和测试提前准备。</w:t>
+        <w:t>高频、第一屏、扫码、主任务</w:t>
       </w:r>
     </w:p>
     <w:p>
@@ -807,10 +436,21 @@
         <w:rPr>
           <w:b/>
         </w:rPr>
-        <w:t>产品/BI 场：</w:t>
+        <w:t>讲稿：</w:t>
       </w:r>
+    </w:p>
+    <w:p>
       <w:r>
-        <w:t>重点讲每个字段为什么必要，尤其是不做什么、验收、依赖、风险。</w:t>
+        <w:t>这里用深圳微信乘车码做一个 benchmark。这个场景非常高频，用户打开页面的目的很明确，就是快速刷码进站。所以第一屏最重要的不是炫技，而是让二维码稳定、显眼、快速可用。</w:t>
+      </w:r>
+    </w:p>
+    <w:p/>
+    <w:p>
+      <w:pPr>
+        <w:pStyle w:val="Heading2"/>
+      </w:pPr>
+      <w:r>
+        <w:t>14. 完整功能链路</w:t>
       </w:r>
     </w:p>
     <w:p>
@@ -818,10 +458,10 @@
         <w:rPr>
           <w:b/>
         </w:rPr>
-        <w:t>研发场：</w:t>
+        <w:t>关键词：</w:t>
       </w:r>
       <w:r>
-        <w:t>讲这些字段就是研发开工前需要拿到的输入。</w:t>
+        <w:t>前台体验、后台协作、状态、异常</w:t>
       </w:r>
     </w:p>
     <w:p>
@@ -829,23 +469,21 @@
         <w:rPr>
           <w:b/>
         </w:rPr>
-        <w:t>跳页建议：</w:t>
-      </w:r>
-      <w:r>
-        <w:t>两场都建议保留。</w:t>
+        <w:t>讲稿：</w:t>
       </w:r>
     </w:p>
+    <w:p>
+      <w:r>
+        <w:t>一个乘车码看起来只是一个二维码，但背后其实是一整条链路。前台有二维码、tab、刷新、失败提示；后台有账号、权限、码状态、日志和异常处理。所以产品写需求时，不能只写页面，还要把状态和链路写出来。</w:t>
+      </w:r>
+    </w:p>
+    <w:p/>
     <w:p>
       <w:pPr>
         <w:pStyle w:val="Heading2"/>
       </w:pPr>
       <w:r>
-        <w:t>8. UX 双视角</w:t>
-      </w:r>
-    </w:p>
-    <w:p>
-      <w:r>
-        <w:t>建议用时：1.6 min</w:t>
+        <w:t>15. 产品思维网域</w:t>
       </w:r>
     </w:p>
     <w:p>
@@ -853,10 +491,10 @@
         <w:rPr>
           <w:b/>
         </w:rPr>
-        <w:t>主讲稿：</w:t>
+        <w:t>关键词：</w:t>
       </w:r>
       <w:r>
-        <w:t>UX 不是把页面做漂亮，而是降低用户完成任务的成本。产品要定义主路径、主动作、视觉层级和异常状态；研发要按设计系统实现，不能漏 loading、empty、error、disabled，也不要手写奇怪颜色和组件。</w:t>
+        <w:t>用户、任务、主路径、边界、验证</w:t>
       </w:r>
     </w:p>
     <w:p>
@@ -864,10 +502,21 @@
         <w:rPr>
           <w:b/>
         </w:rPr>
-        <w:t>产品/BI 场：</w:t>
+        <w:t>讲稿：</w:t>
       </w:r>
+    </w:p>
+    <w:p>
       <w:r>
-        <w:t>重点讲左侧：怎么把 UX 要求写进需求和验收。</w:t>
+        <w:t>产品判断可以拆成几个长期问题：用户是谁，要完成什么任务，主路径是什么，哪些东西这版不做，价值怎么验证，失败状态怎么处理。产品能力不是写功能名，而是持续回答这些问题。</w:t>
+      </w:r>
+    </w:p>
+    <w:p/>
+    <w:p>
+      <w:pPr>
+        <w:pStyle w:val="Heading2"/>
+      </w:pPr>
+      <w:r>
+        <w:t>16. 需求质量</w:t>
       </w:r>
     </w:p>
     <w:p>
@@ -875,10 +524,10 @@
         <w:rPr>
           <w:b/>
         </w:rPr>
-        <w:t>研发场：</w:t>
+        <w:t>关键词：</w:t>
       </w:r>
       <w:r>
-        <w:t>重点讲右侧：怎么避免实现走样。</w:t>
+        <w:t>功能名、场景、验收、状态</w:t>
       </w:r>
     </w:p>
     <w:p>
@@ -886,23 +535,21 @@
         <w:rPr>
           <w:b/>
         </w:rPr>
-        <w:t>跳页建议：</w:t>
-      </w:r>
-      <w:r>
-        <w:t>两场都保留。</w:t>
+        <w:t>讲稿：</w:t>
       </w:r>
     </w:p>
+    <w:p>
+      <w:r>
+        <w:t>这一页是一个很典型的对比。“做一个深圳乘车码页面”其实不是一个好需求，因为研发不知道做到什么算完成。更好的写法是把场景和验收说出来：进入后看到地铁乘车码，二维码多久刷新，网络异常、截图、未开通分别怎么处理。</w:t>
+      </w:r>
+    </w:p>
+    <w:p/>
     <w:p>
       <w:pPr>
         <w:pStyle w:val="Heading2"/>
       </w:pPr>
       <w:r>
-        <w:t>9. 乘车码页面该让用户先看到什么</w:t>
-      </w:r>
-    </w:p>
-    <w:p>
-      <w:r>
-        <w:t>建议用时：1.4 min</w:t>
+        <w:t>17. 需求模板</w:t>
       </w:r>
     </w:p>
     <w:p>
@@ -910,10 +557,10 @@
         <w:rPr>
           <w:b/>
         </w:rPr>
-        <w:t>主讲稿：</w:t>
+        <w:t>关键词：</w:t>
       </w:r>
       <w:r>
-        <w:t>用这页讲视觉层级。用户进来第一眼要确认当前城市和可用状态，第二眼要看到二维码，辅助入口和 tab 不能抢焦点。重点色只应该服务关键动作和关键状态。</w:t>
+        <w:t>背景、目标、范围、验收、依赖</w:t>
       </w:r>
     </w:p>
     <w:p>
@@ -921,10 +568,21 @@
         <w:rPr>
           <w:b/>
         </w:rPr>
-        <w:t>产品/BI 场：</w:t>
+        <w:t>讲稿：</w:t>
       </w:r>
+    </w:p>
+    <w:p>
       <w:r>
-        <w:t>可以讲需求里要写：主按钮、辅助入口、异常状态、tab 任务。</w:t>
+        <w:t>好需求不用特别复杂，但至少要写清背景、目标、范围、验收和依赖。背景解释为什么做，目标说明解决什么问题，范围说本版做什么不做什么，验收说明怎么判断完成，依赖让研发知道要和谁对齐。</w:t>
+      </w:r>
+    </w:p>
+    <w:p/>
+    <w:p>
+      <w:pPr>
+        <w:pStyle w:val="Heading2"/>
+      </w:pPr>
+      <w:r>
+        <w:t>18. 成功首屏</w:t>
       </w:r>
     </w:p>
     <w:p>
@@ -932,10 +590,10 @@
         <w:rPr>
           <w:b/>
         </w:rPr>
-        <w:t>研发场：</w:t>
+        <w:t>关键词：</w:t>
       </w:r>
       <w:r>
-        <w:t>可以讲真实数据、长文案、异常状态下页面不能变形。</w:t>
+        <w:t>1 秒可用、二维码、视觉层级、低干扰</w:t>
       </w:r>
     </w:p>
     <w:p>
@@ -943,23 +601,21 @@
         <w:rPr>
           <w:b/>
         </w:rPr>
-        <w:t>跳页建议：</w:t>
-      </w:r>
-      <w:r>
-        <w:t>研发场可快速过，但不要完全跳。</w:t>
+        <w:t>讲稿：</w:t>
       </w:r>
     </w:p>
+    <w:p>
+      <w:r>
+        <w:t>成功的首屏应该让用户一眼知道怎么完成任务。对于乘车码来说，二维码就是主视觉，其他功能都要给它让位。好的 UX 不是元素越多越好，而是用户不用思考就能完成最重要的动作。</w:t>
+      </w:r>
+    </w:p>
+    <w:p/>
     <w:p>
       <w:pPr>
         <w:pStyle w:val="Heading2"/>
       </w:pPr>
       <w:r>
-        <w:t>10. 功能开发不是写完代码</w:t>
-      </w:r>
-    </w:p>
-    <w:p>
-      <w:r>
-        <w:t>建议用时：1.5 min</w:t>
+        <w:t>19. Bad Case：过度智能化</w:t>
       </w:r>
     </w:p>
     <w:p>
@@ -967,10 +623,10 @@
         <w:rPr>
           <w:b/>
         </w:rPr>
-        <w:t>主讲稿：</w:t>
+        <w:t>关键词：</w:t>
       </w:r>
       <w:r>
-        <w:t>这页讲完整研发流程。每个阶段都有不同 owner 和交付物。没有 QA 的情况下，质量更不能被丢给某一个角色；产品、BI、研发都要对用户路径和验收结果负责。</w:t>
+        <w:t>AI 辅助、主路径、取舍、1 秒任务</w:t>
       </w:r>
     </w:p>
     <w:p>
@@ -978,10 +634,21 @@
         <w:rPr>
           <w:b/>
         </w:rPr>
-        <w:t>产品/BI 场：</w:t>
+        <w:t>讲稿：</w:t>
       </w:r>
+    </w:p>
+    <w:p>
       <w:r>
-        <w:t>快速过，强调自己也要参与验收和上线准备。</w:t>
+        <w:t>这一页想说的是，AI 能力可以加，但不能挡住主路径。比如路线规划、服务推荐都可以做，但它们应该服务辅助任务。如果一个原本 1 秒能完成的刷码动作，被 AI 变成 1 分钟的复杂交互，那就是产品取舍出了问题。</w:t>
+      </w:r>
+    </w:p>
+    <w:p/>
+    <w:p>
+      <w:pPr>
+        <w:pStyle w:val="Heading2"/>
+      </w:pPr>
+      <w:r>
+        <w:t>20. UX 双视角</w:t>
       </w:r>
     </w:p>
     <w:p>
@@ -989,10 +656,10 @@
         <w:rPr>
           <w:b/>
         </w:rPr>
-        <w:t>研发场：</w:t>
+        <w:t>关键词：</w:t>
       </w:r>
       <w:r>
-        <w:t>重点页，讲研发要主动管理接口、联调、上线、复盘。</w:t>
+        <w:t>产品写清、研发实现、设计系统、异常状态</w:t>
       </w:r>
     </w:p>
     <w:p>
@@ -1000,23 +667,21 @@
         <w:rPr>
           <w:b/>
         </w:rPr>
-        <w:t>跳页建议：</w:t>
-      </w:r>
-      <w:r>
-        <w:t>产品场可压缩。</w:t>
+        <w:t>讲稿：</w:t>
       </w:r>
     </w:p>
+    <w:p>
+      <w:r>
+        <w:t>同一个 UX 要求，产品和研发关注点不一样。产品要写清主视觉、视觉层级、状态和异常；研发要保证真实数据、长文案、不同屏幕尺寸下不走样。所以 UX 不是设计同学一个人的事，需求和实现都会影响最终体验。</w:t>
+      </w:r>
+    </w:p>
+    <w:p/>
     <w:p>
       <w:pPr>
         <w:pStyle w:val="Heading2"/>
       </w:pPr>
       <w:r>
-        <w:t>11. 每个阶段都要有交付物</w:t>
-      </w:r>
-    </w:p>
-    <w:p>
-      <w:r>
-        <w:t>建议用时：1.6 min</w:t>
+        <w:t>21. 研发管理流程封面</w:t>
       </w:r>
     </w:p>
     <w:p>
@@ -1024,10 +689,10 @@
         <w:rPr>
           <w:b/>
         </w:rPr>
-        <w:t>主讲稿：</w:t>
+        <w:t>关键词：</w:t>
       </w:r>
       <w:r>
-        <w:t>口头共识很脆弱。需求卡、原型、接口契约、SIT 清单、验收用例、release note、GSheet 状态和复盘记录，都是为了减少信息在不同人脑子里的偏差。</w:t>
+        <w:t>可开发、可联调、可验收、可发布、可恢复</w:t>
       </w:r>
     </w:p>
     <w:p>
@@ -1035,10 +700,21 @@
         <w:rPr>
           <w:b/>
         </w:rPr>
-        <w:t>产品/BI 场：</w:t>
+        <w:t>讲稿：</w:t>
       </w:r>
+    </w:p>
+    <w:p>
       <w:r>
-        <w:t>重点讲需求卡、原型/状态表、验收用例、GSheet。</w:t>
+        <w:t>第三部分讲研发管理流程。这里不是要管大家怎么写代码，而是看需求能不能持续流转到几个状态：可开发、可联调、可验收、可发布、可恢复。我们没有 QA，跨模块又多，所以这些状态更要说清楚。</w:t>
+      </w:r>
+    </w:p>
+    <w:p/>
+    <w:p>
+      <w:pPr>
+        <w:pStyle w:val="Heading2"/>
+      </w:pPr>
+      <w:r>
+        <w:t>22. 成熟研发团队的 5 种能力</w:t>
       </w:r>
     </w:p>
     <w:p>
@@ -1046,10 +722,10 @@
         <w:rPr>
           <w:b/>
         </w:rPr>
-        <w:t>研发场：</w:t>
+        <w:t>关键词：</w:t>
       </w:r>
       <w:r>
-        <w:t>重点讲接口契约、SIT 清单、release note、复盘。</w:t>
+        <w:t>可维护、可观测、可持续交付、可度量、边界清晰</w:t>
       </w:r>
     </w:p>
     <w:p>
@@ -1057,23 +733,21 @@
         <w:rPr>
           <w:b/>
         </w:rPr>
-        <w:t>跳页建议：</w:t>
-      </w:r>
-      <w:r>
-        <w:t>两场都保留。</w:t>
+        <w:t>讲稿：</w:t>
       </w:r>
     </w:p>
+    <w:p>
+      <w:r>
+        <w:t>这一页不是为了推荐书，而是总结成熟研发团队需要具备的五种能力：可维护、可观测、可持续交付、可度量、边界清晰。翻译成日常语言就是：能不能改，能不能查，能不能稳稳发布，能不能衡量效率，能不能减少扯皮。</w:t>
+      </w:r>
+    </w:p>
+    <w:p/>
     <w:p>
       <w:pPr>
         <w:pStyle w:val="Heading2"/>
       </w:pPr>
       <w:r>
-        <w:t>12. 不要只说下周二 SIT</w:t>
-      </w:r>
-    </w:p>
-    <w:p>
-      <w:r>
-        <w:t>建议用时：1.7 min</w:t>
+        <w:t>23. 关注交付状态</w:t>
       </w:r>
     </w:p>
     <w:p>
@@ -1081,10 +755,10 @@
         <w:rPr>
           <w:b/>
         </w:rPr>
-        <w:t>主讲稿：</w:t>
+        <w:t>关键词：</w:t>
       </w:r>
       <w:r>
-        <w:t>这是整场最实用的一页。合作同理心不是语气好，而是提前告诉对方要准备什么。SIT 要讲清联调对象、接口、测试账号、环境、设备/模拟器、验收标准和失败时谁看日志。</w:t>
+        <w:t>代码进度、交付状态、进入条件、退出交付物</w:t>
       </w:r>
     </w:p>
     <w:p>
@@ -1092,10 +766,21 @@
         <w:rPr>
           <w:b/>
         </w:rPr>
-        <w:t>产品/BI 场：</w:t>
+        <w:t>讲稿：</w:t>
       </w:r>
+    </w:p>
+    <w:p>
       <w:r>
-        <w:t>强调产品/BI 也要准备测试账号、测试数据和验收标准。</w:t>
+        <w:t>代码写完只是中间点。真正要看的是这个需求现在处于什么交付状态：可开发了吗，可联调了吗，可验收了吗，可发布了吗，线上出问题能恢复吗。每个状态都要有进入条件和退出交付物，否则看起来在推进，下一阶段还是接不住。</w:t>
+      </w:r>
+    </w:p>
+    <w:p/>
+    <w:p>
+      <w:pPr>
+        <w:pStyle w:val="Heading2"/>
+      </w:pPr>
+      <w:r>
+        <w:t>24. 6 个可流转状态</w:t>
       </w:r>
     </w:p>
     <w:p>
@@ -1103,10 +788,10 @@
         <w:rPr>
           <w:b/>
         </w:rPr>
-        <w:t>研发场：</w:t>
+        <w:t>关键词：</w:t>
       </w:r>
       <w:r>
-        <w:t>强调研发要提前给接口清单、日志 owner 和排障路径。</w:t>
+        <w:t>可开发、可评审、可联调、可验收、可发布、可恢复</w:t>
       </w:r>
     </w:p>
     <w:p>
@@ -1114,23 +799,21 @@
         <w:rPr>
           <w:b/>
         </w:rPr>
-        <w:t>跳页建议：</w:t>
-      </w:r>
-      <w:r>
-        <w:t>两场都重点保留。</w:t>
+        <w:t>讲稿：</w:t>
       </w:r>
     </w:p>
+    <w:p>
+      <w:r>
+        <w:t>这里把研发流程拆成六个状态。可开发看需求和依赖，可评审看方案和接口，可联调看环境和数据，可验收看测试证据，可发布看灰度和回滚，可恢复看线上问题能不能定位和止损。PIC 的价值就是保证这个状态真的能往下走。</w:t>
+      </w:r>
+    </w:p>
+    <w:p/>
     <w:p>
       <w:pPr>
         <w:pStyle w:val="Heading2"/>
       </w:pPr>
       <w:r>
-        <w:t>13. 版本不是时间标签，是 scope 承诺</w:t>
-      </w:r>
-    </w:p>
-    <w:p>
-      <w:r>
-        <w:t>建议用时：1.4 min</w:t>
+        <w:t>25. 阶段准备</w:t>
       </w:r>
     </w:p>
     <w:p>
@@ -1138,10 +821,10 @@
         <w:rPr>
           <w:b/>
         </w:rPr>
-        <w:t>主讲稿：</w:t>
+        <w:t>关键词：</w:t>
       </w:r>
       <w:r>
-        <w:t>版本管理不是给日期起名字。V1 要保证主路径可用，V1.1 让功能更稳定，V2 再做扩展。这样团队知道当前要保护什么，也知道哪些需求不该硬塞进当前版本。</w:t>
+        <w:t>开发前、评审前、联调前、验收前、发布前、上线后</w:t>
       </w:r>
     </w:p>
     <w:p>
@@ -1149,10 +832,21 @@
         <w:rPr>
           <w:b/>
         </w:rPr>
-        <w:t>产品/BI 场：</w:t>
+        <w:t>讲稿：</w:t>
       </w:r>
+    </w:p>
+    <w:p>
       <w:r>
-        <w:t>讲范围收口和不做什么。</w:t>
+        <w:t>每个阶段进入下一阶段前，都要提前准备材料。开发前准备需求和范围，评审前准备方案和接口，联调前准备环境和数据，验收前准备测试证据，发布前准备灰度和回滚，上线后准备观察和复盘。</w:t>
+      </w:r>
+    </w:p>
+    <w:p/>
+    <w:p>
+      <w:pPr>
+        <w:pStyle w:val="Heading2"/>
+      </w:pPr>
+      <w:r>
+        <w:t>26. 风险与延期</w:t>
       </w:r>
     </w:p>
     <w:p>
@@ -1160,10 +854,10 @@
         <w:rPr>
           <w:b/>
         </w:rPr>
-        <w:t>研发场：</w:t>
+        <w:t>关键词：</w:t>
       </w:r>
       <w:r>
-        <w:t>讲分支、配置、灰度、回滚都依赖明确 scope。</w:t>
+        <w:t>影响、选项、建议、时间点、决策人</w:t>
       </w:r>
     </w:p>
     <w:p>
@@ -1171,23 +865,21 @@
         <w:rPr>
           <w:b/>
         </w:rPr>
-        <w:t>跳页建议：</w:t>
-      </w:r>
-      <w:r>
-        <w:t>两场都保留。</w:t>
+        <w:t>讲稿：</w:t>
       </w:r>
     </w:p>
+    <w:p>
+      <w:r>
+        <w:t>研发报风险时，也尽量不要只说“可能延期”。更好的表达是：晚了什么，影响哪条路径，有哪些选项，建议怎么选，需要谁在什么时候确认。这样风险就从坏消息变成可决策问题。</w:t>
+      </w:r>
+    </w:p>
+    <w:p/>
     <w:p>
       <w:pPr>
         <w:pStyle w:val="Heading2"/>
       </w:pPr>
       <w:r>
-        <w:t>14. 新需求来了，不是直接塞进当前版本</w:t>
-      </w:r>
-    </w:p>
-    <w:p>
-      <w:r>
-        <w:t>建议用时：1.5 min</w:t>
+        <w:t>27. Testing / UAT</w:t>
       </w:r>
     </w:p>
     <w:p>
@@ -1195,10 +887,10 @@
         <w:rPr>
           <w:b/>
         </w:rPr>
-        <w:t>主讲稿：</w:t>
+        <w:t>关键词：</w:t>
       </w:r>
       <w:r>
-        <w:t>变更不是不能做，不能做的是让大家不知道 scope 已经变了。每次变更都要问：是否影响上线目标，是否替换已有 scope，是否影响依赖、联调和验收，谁拍板。</w:t>
+        <w:t>无 QA、验收前置、主路径、异常路径、回归</w:t>
       </w:r>
     </w:p>
     <w:p>
@@ -1206,10 +898,21 @@
         <w:rPr>
           <w:b/>
         </w:rPr>
-        <w:t>产品/BI 场：</w:t>
+        <w:t>讲稿：</w:t>
       </w:r>
+    </w:p>
+    <w:p>
       <w:r>
-        <w:t>重点讲变更记录和影响评估。</w:t>
+        <w:t>没有 QA 的团队，更要把验收前置。产品负责业务正确性，研发负责实现正确性和可观测。测试不能只跑 happy path，还要覆盖异常路径、边界数据、回归范围和上线观察项。</w:t>
+      </w:r>
+    </w:p>
+    <w:p/>
+    <w:p>
+      <w:pPr>
+        <w:pStyle w:val="Heading2"/>
+      </w:pPr>
+      <w:r>
+        <w:t>28. Summary 封面</w:t>
       </w:r>
     </w:p>
     <w:p>
@@ -1217,10 +920,10 @@
         <w:rPr>
           <w:b/>
         </w:rPr>
-        <w:t>研发场：</w:t>
+        <w:t>关键词：</w:t>
       </w:r>
       <w:r>
-        <w:t>重点讲变更对技术方案、联调、测试和上线窗口的影响。</w:t>
+        <w:t>好习惯、稳定交付、产品/研发/项目</w:t>
       </w:r>
     </w:p>
     <w:p>
@@ -1228,23 +931,21 @@
         <w:rPr>
           <w:b/>
         </w:rPr>
-        <w:t>跳页建议：</w:t>
-      </w:r>
-      <w:r>
-        <w:t>两场都保留。</w:t>
+        <w:t>讲稿：</w:t>
       </w:r>
     </w:p>
+    <w:p>
+      <w:r>
+        <w:t>最后回到一个核心：稳定交付不是靠临场救火，而是靠平时的好习惯。产品、研发、项目经理各自把关键动作做好，团队就会少很多返工和扯皮。</w:t>
+      </w:r>
+    </w:p>
+    <w:p/>
     <w:p>
       <w:pPr>
         <w:pStyle w:val="Heading2"/>
       </w:pPr>
       <w:r>
-        <w:t>15. 不要只报坏消息，要带选项</w:t>
-      </w:r>
-    </w:p>
-    <w:p>
-      <w:r>
-        <w:t>建议用时：1.4 min</w:t>
+        <w:t>29. Checklist</w:t>
       </w:r>
     </w:p>
     <w:p>
@@ -1252,10 +953,10 @@
         <w:rPr>
           <w:b/>
         </w:rPr>
-        <w:t>主讲稿：</w:t>
+        <w:t>关键词：</w:t>
       </w:r>
       <w:r>
-        <w:t>延期和风险的表达要能帮助决策。不要只说可能延期，要给选项：砍 scope、拆灰度、换版本、补资源。每个选项都要说明影响和代价。</w:t>
+        <w:t>产品习惯、研发习惯、项目习惯、沉淀</w:t>
       </w:r>
     </w:p>
     <w:p>
@@ -1263,10 +964,21 @@
         <w:rPr>
           <w:b/>
         </w:rPr>
-        <w:t>产品/BI 场：</w:t>
+        <w:t>讲稿：</w:t>
       </w:r>
+    </w:p>
+    <w:p>
       <w:r>
-        <w:t>讲如何向项目团队同步风险和业务影响。</w:t>
+        <w:t>这一页可以当成带走的 checklist。产品要写清场景、范围、验收和 UX；研发要说清状态、材料、风险和回滚；项目经理要让 owner、时间、依赖和风险持续可见。习惯越稳定，AI 提效才越能真正落地。</w:t>
+      </w:r>
+    </w:p>
+    <w:p/>
+    <w:p>
+      <w:pPr>
+        <w:pStyle w:val="Heading2"/>
+      </w:pPr>
+      <w:r>
+        <w:t>30. Closing</w:t>
       </w:r>
     </w:p>
     <w:p>
@@ -1274,10 +986,10 @@
         <w:rPr>
           <w:b/>
         </w:rPr>
-        <w:t>研发场：</w:t>
+        <w:t>关键词：</w:t>
       </w:r>
       <w:r>
-        <w:t>讲如何把技术风险翻译成可决策的项目选项。</w:t>
+        <w:t>Good taste、判断力、AI 提速、人把关</w:t>
       </w:r>
     </w:p>
     <w:p>
@@ -1285,230 +997,17 @@
         <w:rPr>
           <w:b/>
         </w:rPr>
-        <w:t>跳页建议：</w:t>
-      </w:r>
-      <w:r>
-        <w:t>两场都保留。</w:t>
-      </w:r>
-    </w:p>
-    <w:p>
-      <w:pPr>
-        <w:pStyle w:val="Heading2"/>
-      </w:pPr>
-      <w:r>
-        <w:t>16. GSheet 单一事实源</w:t>
+        <w:t>讲稿：</w:t>
       </w:r>
     </w:p>
     <w:p>
       <w:r>
-        <w:t>建议用时：1.4 min</w:t>
-      </w:r>
-    </w:p>
-    <w:p>
-      <w:r>
-        <w:rPr>
-          <w:b/>
-        </w:rPr>
-        <w:t>主讲稿：</w:t>
-      </w:r>
-      <w:r>
-        <w:t>你们实际用 GSheet，所以不用强推 GitHub/Jira。关键是每一行任务必须有 owner、status、due date、dependency、验收口径和 risk note。聊天可以沟通，GSheet 才是事实源。</w:t>
-      </w:r>
-    </w:p>
-    <w:p>
-      <w:r>
-        <w:rPr>
-          <w:b/>
-        </w:rPr>
-        <w:t>产品/BI 场：</w:t>
-      </w:r>
-      <w:r>
-        <w:t>强调每天更新状态和验收口径。</w:t>
-      </w:r>
-    </w:p>
-    <w:p>
-      <w:r>
-        <w:rPr>
-          <w:b/>
-        </w:rPr>
-        <w:t>研发场：</w:t>
-      </w:r>
-      <w:r>
-        <w:t>强调风险、阻塞、依赖不要只在私聊里说。</w:t>
-      </w:r>
-    </w:p>
-    <w:p>
-      <w:r>
-        <w:rPr>
-          <w:b/>
-        </w:rPr>
-        <w:t>跳页建议：</w:t>
-      </w:r>
-      <w:r>
-        <w:t>两场都保留。</w:t>
-      </w:r>
-    </w:p>
-    <w:p>
-      <w:pPr>
-        <w:pStyle w:val="Heading2"/>
-      </w:pPr>
-      <w:r>
-        <w:t>17. BI 和研发各自 5 个好习惯</w:t>
-      </w:r>
-    </w:p>
-    <w:p>
-      <w:r>
-        <w:t>建议用时：1.4 min</w:t>
-      </w:r>
-    </w:p>
-    <w:p>
-      <w:r>
-        <w:rPr>
-          <w:b/>
-        </w:rPr>
-        <w:t>主讲稿：</w:t>
-      </w:r>
-      <w:r>
-        <w:t>这页做收束。不要让大家只听完觉得有道理，要带走下周能用的动作。BI 从需求质量和验收开始，研发从接口契约、联调准备、版本风险开始。</w:t>
-      </w:r>
-    </w:p>
-    <w:p>
-      <w:r>
-        <w:rPr>
-          <w:b/>
-        </w:rPr>
-        <w:t>产品/BI 场：</w:t>
-      </w:r>
-      <w:r>
-        <w:t>逐条点产品/BI 的 checklist。</w:t>
-      </w:r>
-    </w:p>
-    <w:p>
-      <w:r>
-        <w:rPr>
-          <w:b/>
-        </w:rPr>
-        <w:t>研发场：</w:t>
-      </w:r>
-      <w:r>
-        <w:t>逐条点研发的 checklist。</w:t>
-      </w:r>
-    </w:p>
-    <w:p>
-      <w:r>
-        <w:rPr>
-          <w:b/>
-        </w:rPr>
-        <w:t>跳页建议：</w:t>
-      </w:r>
-      <w:r>
-        <w:t>两场都保留。</w:t>
-      </w:r>
-    </w:p>
-    <w:p>
-      <w:pPr>
-        <w:pStyle w:val="Heading2"/>
-      </w:pPr>
-      <w:r>
-        <w:t>18. 高质量交付的本质</w:t>
-      </w:r>
-    </w:p>
-    <w:p>
-      <w:r>
-        <w:t>建议用时：0.8 min</w:t>
-      </w:r>
-    </w:p>
-    <w:p>
-      <w:r>
-        <w:rPr>
-          <w:b/>
-        </w:rPr>
-        <w:t>主讲稿：</w:t>
-      </w:r>
-      <w:r>
-        <w:t>结尾回到一句话：让合作方更容易和你合作。产品判断、研发流程、项目协作都不是为了显得专业，而是为了提前讲清目标、边界、依赖、风险和验收。</w:t>
-      </w:r>
-    </w:p>
-    <w:p>
-      <w:r>
-        <w:rPr>
-          <w:b/>
-        </w:rPr>
-        <w:t>产品/BI 场：</w:t>
-      </w:r>
-      <w:r>
-        <w:t>回扣需求和 UX。</w:t>
-      </w:r>
-    </w:p>
-    <w:p>
-      <w:r>
-        <w:rPr>
-          <w:b/>
-        </w:rPr>
-        <w:t>研发场：</w:t>
-      </w:r>
-      <w:r>
-        <w:t>回扣流程和风险。</w:t>
-      </w:r>
-    </w:p>
-    <w:p>
-      <w:r>
-        <w:rPr>
-          <w:b/>
-        </w:rPr>
-        <w:t>跳页建议：</w:t>
-      </w:r>
-      <w:r>
-        <w:t>两场都保留。</w:t>
-      </w:r>
-    </w:p>
-    <w:p>
-      <w:pPr>
-        <w:pStyle w:val="Heading1"/>
-      </w:pPr>
-      <w:r>
-        <w:t>参考资料</w:t>
-      </w:r>
-    </w:p>
-    <w:p>
-      <w:pPr>
-        <w:pStyle w:val="ListBullet"/>
-        <w:spacing w:after="60"/>
-      </w:pPr>
-      <w:r>
-        <w:t>Ant Design 设计价值观、色彩、导航、反馈：用于 UX 页的视觉层级、重点色、组件状态原则。</w:t>
-      </w:r>
-    </w:p>
-    <w:p>
-      <w:pPr>
-        <w:pStyle w:val="ListBullet"/>
-        <w:spacing w:after="60"/>
-      </w:pPr>
-      <w:r>
-        <w:t>Scrum Guide：用于角色责任、事件、增量和 Definition of Done 的底层参考。</w:t>
-      </w:r>
-    </w:p>
-    <w:p>
-      <w:pPr>
-        <w:pStyle w:val="ListBullet"/>
-        <w:spacing w:after="60"/>
-      </w:pPr>
-      <w:r>
-        <w:t>DORA Four Keys：用于说明交付质量同时关注速度和稳定性。</w:t>
-      </w:r>
-    </w:p>
-    <w:p>
-      <w:pPr>
-        <w:pStyle w:val="ListBullet"/>
-        <w:spacing w:after="60"/>
-      </w:pPr>
-      <w:r>
-        <w:t>GitHub Projects best practices：用于 issue/status/dependency/roadmap 的轻量项目管理参考。</w:t>
+        <w:t>最后收一下。AI 会提高产出速度，但人的判断力决定产出质量。未来很多执行都会变快，真正重要的是我们能不能判断什么是好的、什么该删掉、什么风险必须提前暴露。希望大家之后不只是把事情做完，而是一起把事情做好。</w:t>
       </w:r>
     </w:p>
     <w:sectPr>
       <w:pgSz w:w="12240" w:h="15840"/>
-      <w:pgMar w:top="1037" w:right="1037" w:bottom="979" w:left="1037" w:header="720" w:footer="720" w:gutter="0"/>
+      <w:pgMar w:top="1440" w:right="1800" w:bottom="1440" w:left="1800" w:header="720" w:footer="720" w:gutter="0"/>
       <w:cols w:space="720"/>
       <w:docGrid w:linePitch="360"/>
     </w:sectPr>
@@ -1879,13 +1378,6 @@
     <w:name w:val="Normal"/>
     <w:qFormat/>
     <w:rsid w:val="00FC693F"/>
-    <w:pPr>
-      <w:spacing w:after="100" w:line="283" w:lineRule="auto"/>
-    </w:pPr>
-    <w:rPr>
-      <w:rFonts w:ascii="Calibri" w:hAnsi="Calibri"/>
-      <w:sz w:val="21"/>
-    </w:rPr>
   </w:style>
   <w:style w:type="paragraph" w:styleId="Header">
     <w:name w:val="header"/>
@@ -1942,15 +1434,15 @@
     <w:pPr>
       <w:keepNext/>
       <w:keepLines/>
-      <w:spacing w:before="280" w:after="140"/>
+      <w:spacing w:before="480" w:after="0"/>
       <w:outlineLvl w:val="0"/>
     </w:pPr>
     <w:rPr>
-      <w:rFonts w:asciiTheme="majorHAnsi" w:eastAsiaTheme="majorEastAsia" w:hAnsiTheme="majorHAnsi" w:cstheme="majorBidi" w:ascii="Calibri" w:hAnsi="Calibri"/>
+      <w:rFonts w:asciiTheme="majorHAnsi" w:eastAsiaTheme="majorEastAsia" w:hAnsiTheme="majorHAnsi" w:cstheme="majorBidi"/>
       <w:b/>
       <w:bCs/>
-      <w:color w:val="2E74B5"/>
-      <w:sz w:val="34"/>
+      <w:color w:val="365F91" w:themeColor="accent1" w:themeShade="BF"/>
+      <w:sz w:val="28"/>
       <w:szCs w:val="28"/>
     </w:rPr>
   </w:style>
@@ -1966,14 +1458,14 @@
     <w:pPr>
       <w:keepNext/>
       <w:keepLines/>
-      <w:spacing w:before="200" w:after="100"/>
+      <w:spacing w:before="200" w:after="0"/>
       <w:outlineLvl w:val="1"/>
     </w:pPr>
     <w:rPr>
-      <w:rFonts w:asciiTheme="majorHAnsi" w:eastAsiaTheme="majorEastAsia" w:hAnsiTheme="majorHAnsi" w:cstheme="majorBidi" w:ascii="Calibri" w:hAnsi="Calibri"/>
+      <w:rFonts w:asciiTheme="majorHAnsi" w:eastAsiaTheme="majorEastAsia" w:hAnsiTheme="majorHAnsi" w:cstheme="majorBidi"/>
       <w:b/>
       <w:bCs/>
-      <w:color w:val="2E74B5"/>
+      <w:color w:val="4F81BD" w:themeColor="accent1"/>
       <w:sz w:val="26"/>
       <w:szCs w:val="26"/>
     </w:rPr>
@@ -1990,15 +1482,14 @@
     <w:pPr>
       <w:keepNext/>
       <w:keepLines/>
-      <w:spacing w:before="140" w:after="60"/>
+      <w:spacing w:before="200" w:after="0"/>
       <w:outlineLvl w:val="2"/>
     </w:pPr>
     <w:rPr>
-      <w:rFonts w:asciiTheme="majorHAnsi" w:eastAsiaTheme="majorEastAsia" w:hAnsiTheme="majorHAnsi" w:cstheme="majorBidi" w:ascii="Calibri" w:hAnsi="Calibri"/>
+      <w:rFonts w:asciiTheme="majorHAnsi" w:eastAsiaTheme="majorEastAsia" w:hAnsiTheme="majorHAnsi" w:cstheme="majorBidi"/>
       <w:b/>
       <w:bCs/>
-      <w:color w:val="1F4D78"/>
-      <w:sz w:val="23"/>
+      <w:color w:val="4F81BD" w:themeColor="accent1"/>
     </w:rPr>
   </w:style>
   <w:style w:type="paragraph" w:styleId="Heading4">

</xml_diff>

<commit_message>
add maintainability and testing guidance
</commit_message>
<xml_diff>
--- a/document/dev-product-process-training/speaker-notes.docx
+++ b/document/dev-product-process-training/speaker-notes.docx
@@ -516,7 +516,40 @@
         <w:pStyle w:val="Heading2"/>
       </w:pPr>
       <w:r>
-        <w:t>16. 需求质量</w:t>
+        <w:t>16. 看到几个版本后</w:t>
+      </w:r>
+    </w:p>
+    <w:p>
+      <w:r>
+        <w:rPr>
+          <w:b/>
+        </w:rPr>
+        <w:t>关键词：</w:t>
+      </w:r>
+      <w:r>
+        <w:t>业务理解、未来版本、可扩展、可维护</w:t>
+      </w:r>
+    </w:p>
+    <w:p>
+      <w:r>
+        <w:rPr>
+          <w:b/>
+        </w:rPr>
+        <w:t>讲稿：</w:t>
+      </w:r>
+    </w:p>
+    <w:p>
+      <w:r>
+        <w:t>这一页想补一个很关键的点：产品不是只写当前功能，还要理解业务未来可能怎么长。当前版本可以只做 MVP，但要告诉研发未来可能会接什么场景、什么状态、什么配置。这样研发才知道哪些地方可以先简单做，哪些地方一开始就要留扩展。</w:t>
+      </w:r>
+    </w:p>
+    <w:p/>
+    <w:p>
+      <w:pPr>
+        <w:pStyle w:val="Heading2"/>
+      </w:pPr>
+      <w:r>
+        <w:t>17. 需求质量</w:t>
       </w:r>
     </w:p>
     <w:p>
@@ -549,7 +582,7 @@
         <w:pStyle w:val="Heading2"/>
       </w:pPr>
       <w:r>
-        <w:t>17. 需求模板</w:t>
+        <w:t>18. 需求模板</w:t>
       </w:r>
     </w:p>
     <w:p>
@@ -582,7 +615,7 @@
         <w:pStyle w:val="Heading2"/>
       </w:pPr>
       <w:r>
-        <w:t>18. 成功首屏</w:t>
+        <w:t>19. 成功首屏</w:t>
       </w:r>
     </w:p>
     <w:p>
@@ -615,7 +648,7 @@
         <w:pStyle w:val="Heading2"/>
       </w:pPr>
       <w:r>
-        <w:t>19. Bad Case：过度智能化</w:t>
+        <w:t>20. Bad Case：过度智能化</w:t>
       </w:r>
     </w:p>
     <w:p>
@@ -648,7 +681,7 @@
         <w:pStyle w:val="Heading2"/>
       </w:pPr>
       <w:r>
-        <w:t>20. UX 双视角</w:t>
+        <w:t>21. UX 双视角</w:t>
       </w:r>
     </w:p>
     <w:p>
@@ -681,7 +714,7 @@
         <w:pStyle w:val="Heading2"/>
       </w:pPr>
       <w:r>
-        <w:t>21. 研发管理流程封面</w:t>
+        <w:t>22. 研发管理流程封面</w:t>
       </w:r>
     </w:p>
     <w:p>
@@ -714,7 +747,7 @@
         <w:pStyle w:val="Heading2"/>
       </w:pPr>
       <w:r>
-        <w:t>22. 成熟研发团队的 5 种能力</w:t>
+        <w:t>23. 成熟研发团队的 5 种能力</w:t>
       </w:r>
     </w:p>
     <w:p>
@@ -747,7 +780,40 @@
         <w:pStyle w:val="Heading2"/>
       </w:pPr>
       <w:r>
-        <w:t>23. 关注交付状态</w:t>
+        <w:t>24. 技术债与可用性</w:t>
+      </w:r>
+    </w:p>
+    <w:p>
+      <w:r>
+        <w:rPr>
+          <w:b/>
+        </w:rPr>
+        <w:t>关键词：</w:t>
+      </w:r>
+      <w:r>
+        <w:t>技术债、可用性、可维护、可恢复、文档</w:t>
+      </w:r>
+    </w:p>
+    <w:p>
+      <w:r>
+        <w:rPr>
+          <w:b/>
+        </w:rPr>
+        <w:t>讲稿：</w:t>
+      </w:r>
+    </w:p>
+    <w:p>
+      <w:r>
+        <w:t>成熟研发不只是把功能做出来，还要管理长期成本。技术债就是今天为了赶进度欠下的账，未来会用更高成本还。可用性是业务真的能稳定使用，可维护性是下一个人能看懂能改，可恢复性是线上出事能止损。</w:t>
+      </w:r>
+    </w:p>
+    <w:p/>
+    <w:p>
+      <w:pPr>
+        <w:pStyle w:val="Heading2"/>
+      </w:pPr>
+      <w:r>
+        <w:t>25. 关注交付状态</w:t>
       </w:r>
     </w:p>
     <w:p>
@@ -780,7 +846,7 @@
         <w:pStyle w:val="Heading2"/>
       </w:pPr>
       <w:r>
-        <w:t>24. 6 个可流转状态</w:t>
+        <w:t>26. 6 个可流转状态</w:t>
       </w:r>
     </w:p>
     <w:p>
@@ -813,7 +879,7 @@
         <w:pStyle w:val="Heading2"/>
       </w:pPr>
       <w:r>
-        <w:t>25. 阶段准备</w:t>
+        <w:t>27. 阶段准备</w:t>
       </w:r>
     </w:p>
     <w:p>
@@ -824,7 +890,7 @@
         <w:t>关键词：</w:t>
       </w:r>
       <w:r>
-        <w:t>开发前、评审前、联调前、验收前、发布前、上线后</w:t>
+        <w:t>技术文档、边界、工单、复盘、团队记忆</w:t>
       </w:r>
     </w:p>
     <w:p>
@@ -837,7 +903,7 @@
     </w:p>
     <w:p>
       <w:r>
-        <w:t>每个阶段进入下一阶段前，都要提前准备材料。开发前准备需求和范围，评审前准备方案和接口，联调前准备环境和数据，验收前准备测试证据，发布前准备灰度和回滚，上线后准备观察和复盘。</w:t>
+        <w:t>每个阶段进入下一阶段前，都要提前准备材料，而且这些材料最好沉淀成文档和工单。技术文档让方案可交接，边界文档减少扯皮，工单系统让问题状态可追踪，复盘文档让同一个坑不要反复踩。</w:t>
       </w:r>
     </w:p>
     <w:p/>
@@ -846,7 +912,7 @@
         <w:pStyle w:val="Heading2"/>
       </w:pPr>
       <w:r>
-        <w:t>26. 风险与延期</w:t>
+        <w:t>28. 风险与延期</w:t>
       </w:r>
     </w:p>
     <w:p>
@@ -879,7 +945,7 @@
         <w:pStyle w:val="Heading2"/>
       </w:pPr>
       <w:r>
-        <w:t>27. Testing / UAT</w:t>
+        <w:t>29. Testing / UAT</w:t>
       </w:r>
     </w:p>
     <w:p>
@@ -890,7 +956,7 @@
         <w:t>关键词：</w:t>
       </w:r>
       <w:r>
-        <w:t>无 QA、验收前置、主路径、异常路径、回归</w:t>
+        <w:t>运动员、裁判、规则、回放证据</w:t>
       </w:r>
     </w:p>
     <w:p>
@@ -903,7 +969,7 @@
     </w:p>
     <w:p>
       <w:r>
-        <w:t>没有 QA 的团队，更要把验收前置。产品负责业务正确性，研发负责实现正确性和可观测。测试不能只跑 happy path，还要覆盖异常路径、边界数据、回归范围和上线观察项。</w:t>
+        <w:t>这里用一个比喻：研发像运动员，产品和业务像裁判。运动员上场前要先自测，不能等裁判指出每一个动作；裁判也要提前写清规则，不能临场换标准。截图、日志、测试 case 就是回放证据，有证据问题才好定位。</w:t>
       </w:r>
     </w:p>
     <w:p/>
@@ -912,7 +978,7 @@
         <w:pStyle w:val="Heading2"/>
       </w:pPr>
       <w:r>
-        <w:t>28. Summary 封面</w:t>
+        <w:t>30. Summary 封面</w:t>
       </w:r>
     </w:p>
     <w:p>
@@ -945,7 +1011,7 @@
         <w:pStyle w:val="Heading2"/>
       </w:pPr>
       <w:r>
-        <w:t>29. Checklist</w:t>
+        <w:t>31. Checklist</w:t>
       </w:r>
     </w:p>
     <w:p>
@@ -969,7 +1035,7 @@
     </w:p>
     <w:p>
       <w:r>
-        <w:t>这一页可以当成带走的 checklist。产品要写清场景、范围、验收和 UX；研发要说清状态、材料、风险和回滚；项目经理要让 owner、时间、依赖和风险持续可见。习惯越稳定，AI 提效才越能真正落地。</w:t>
+        <w:t>这一页可以当成带走的 checklist。产品要写清当前需求，也要提示未来版本方向；研发要关注状态、技术债、文档和测试证据；项目经理要让 owner、时间、依赖和风险持续可见。习惯越稳定，AI 提效才越能真正落地。</w:t>
       </w:r>
     </w:p>
     <w:p/>
@@ -978,7 +1044,7 @@
         <w:pStyle w:val="Heading2"/>
       </w:pPr>
       <w:r>
-        <w:t>30. Closing</w:t>
+        <w:t>32. Closing</w:t>
       </w:r>
     </w:p>
     <w:p>

</xml_diff>

<commit_message>
add testing engineer joke
</commit_message>
<xml_diff>
--- a/document/dev-product-process-training/speaker-notes.docx
+++ b/document/dev-product-process-training/speaker-notes.docx
@@ -945,7 +945,40 @@
         <w:pStyle w:val="Heading2"/>
       </w:pPr>
       <w:r>
-        <w:t>29. Testing / UAT</w:t>
+        <w:t>29. 一个测试工程师走进酒吧</w:t>
+      </w:r>
+    </w:p>
+    <w:p>
+      <w:r>
+        <w:rPr>
+          <w:b/>
+        </w:rPr>
+        <w:t>关键词：</w:t>
+      </w:r>
+      <w:r>
+        <w:t>测试重要性、边界条件、真实用户、系统脆弱点</w:t>
+      </w:r>
+    </w:p>
+    <w:p>
+      <w:r>
+        <w:rPr>
+          <w:b/>
+        </w:rPr>
+        <w:t>讲稿：</w:t>
+      </w:r>
+    </w:p>
+    <w:p>
+      <w:r>
+        <w:t>这里用一个经典笑话引一下测试的重要性。测试工程师会点啤酒、点 -1 杯、点 2^32 杯、点 NaN 杯 Null，还会从窗户后门下水道进来，最后都没问题。但真实顾客点了一份炒饭，酒吧炸了。这个笑话不是说测试没用，而是说测试很重要：测试不是穷举所有可能，而是在真实用户把系统炸掉之前，先把最可能炸的地方找出来。</w:t>
+      </w:r>
+    </w:p>
+    <w:p/>
+    <w:p>
+      <w:pPr>
+        <w:pStyle w:val="Heading2"/>
+      </w:pPr>
+      <w:r>
+        <w:t>30. Testing / UAT</w:t>
       </w:r>
     </w:p>
     <w:p>
@@ -978,7 +1011,7 @@
         <w:pStyle w:val="Heading2"/>
       </w:pPr>
       <w:r>
-        <w:t>30. Summary 封面</w:t>
+        <w:t>31. Summary 封面</w:t>
       </w:r>
     </w:p>
     <w:p>
@@ -1011,7 +1044,7 @@
         <w:pStyle w:val="Heading2"/>
       </w:pPr>
       <w:r>
-        <w:t>31. Checklist</w:t>
+        <w:t>32. Checklist</w:t>
       </w:r>
     </w:p>
     <w:p>
@@ -1044,7 +1077,7 @@
         <w:pStyle w:val="Heading2"/>
       </w:pPr>
       <w:r>
-        <w:t>32. Closing</w:t>
+        <w:t>33. Closing</w:t>
       </w:r>
     </w:p>
     <w:p>

</xml_diff>

<commit_message>
remove adversarial testing analogy
</commit_message>
<xml_diff>
--- a/document/dev-product-process-training/speaker-notes.docx
+++ b/document/dev-product-process-training/speaker-notes.docx
@@ -978,40 +978,7 @@
         <w:pStyle w:val="Heading2"/>
       </w:pPr>
       <w:r>
-        <w:t>30. Testing / UAT</w:t>
-      </w:r>
-    </w:p>
-    <w:p>
-      <w:r>
-        <w:rPr>
-          <w:b/>
-        </w:rPr>
-        <w:t>关键词：</w:t>
-      </w:r>
-      <w:r>
-        <w:t>运动员、裁判、规则、回放证据</w:t>
-      </w:r>
-    </w:p>
-    <w:p>
-      <w:r>
-        <w:rPr>
-          <w:b/>
-        </w:rPr>
-        <w:t>讲稿：</w:t>
-      </w:r>
-    </w:p>
-    <w:p>
-      <w:r>
-        <w:t>这里用一个比喻：研发像运动员，产品和业务像裁判。运动员上场前要先自测，不能等裁判指出每一个动作；裁判也要提前写清规则，不能临场换标准。截图、日志、测试 case 就是回放证据，有证据问题才好定位。</w:t>
-      </w:r>
-    </w:p>
-    <w:p/>
-    <w:p>
-      <w:pPr>
-        <w:pStyle w:val="Heading2"/>
-      </w:pPr>
-      <w:r>
-        <w:t>31. Summary 封面</w:t>
+        <w:t>30. Summary 封面</w:t>
       </w:r>
     </w:p>
     <w:p>
@@ -1044,7 +1011,7 @@
         <w:pStyle w:val="Heading2"/>
       </w:pPr>
       <w:r>
-        <w:t>32. Checklist</w:t>
+        <w:t>31. Checklist</w:t>
       </w:r>
     </w:p>
     <w:p>
@@ -1068,7 +1035,7 @@
     </w:p>
     <w:p>
       <w:r>
-        <w:t>这一页可以当成带走的 checklist。产品要写清当前需求，也要提示未来版本方向；研发要关注状态、技术债、文档和测试证据；项目经理要让 owner、时间、依赖和风险持续可见。习惯越稳定，AI 提效才越能真正落地。</w:t>
+        <w:t>这一页可以当成带走的 checklist。产品要写清当前需求，也要提示未来版本方向；研发要关注状态、技术债、文档和测试证据；项目经理要让 owner、时间、依赖和风险持续可见。产品和研发是合作关系，目标是让业务判断、研发验证和项目推进使用同一套标准。</w:t>
       </w:r>
     </w:p>
     <w:p/>
@@ -1077,7 +1044,7 @@
         <w:pStyle w:val="Heading2"/>
       </w:pPr>
       <w:r>
-        <w:t>33. Closing</w:t>
+        <w:t>32. Closing</w:t>
       </w:r>
     </w:p>
     <w:p>

</xml_diff>